<commit_message>
Add 10 richer combinatorial probability word problems (Part 5).
Longer narrative BBE True/False cases covering multisets, raffles,
committees, pairings, seating, Secret Santa derangements, inclusion-exclusion,
lab sampling, exam rows, and tournament selection — without any 1/e comparisons.
Also replaces the Part 4 Coat Check 1/e statement with an exact fixed-point count.

Co-authored-by: Businessma067 <Businessma067@users.noreply.github.com>
</commit_message>
<xml_diff>
--- a/practice/math/Combinatorial_Probability_Practice_Part4.docx
+++ b/practice/math/Combinatorial_Probability_Practice_Part4.docx
@@ -111,7 +111,7 @@
           <w:rFonts w:ascii="Calibri" w:hAnsi="Calibri" w:eastAsia="Calibri"/>
           <w:sz w:val="22"/>
         </w:rPr>
-        <w:t>Derangements: the number of permutations of n items with no fixed points is !n = n! · Σ_{k=0}^{n} (−1)^k / k!, and P(derangement) → 1/e ≈ 0.367879 as n grows. If exactly n−1 items are fixed, the last is automatically fixed, so P(exactly n−1 fixed points) = 0.</w:t>
+        <w:t>Derangements: the number of permutations of n items with no fixed points is !n = n! · Σ_{k=0}^{n} (−1)^k / k!. If exactly n−1 items are fixed, the last is automatically fixed, so P(exactly n−1 fixed points) = 0. Work with the exact ratio !n / n!.</w:t>
       </w:r>
     </w:p>
     <w:p/>
@@ -1423,13 +1423,14 @@
             <w:tcW w:type="dxa" w:w="8640"/>
           </w:tcPr>
           <w:p>
-            <w:r/>
+            <w:r>
+              <w:t>The probability that exactly two guests receive their own coats is greater than 15%.</w:t>
+            </w:r>
             <w:r>
               <w:rPr>
                 <w:rFonts w:ascii="Calibri" w:hAnsi="Calibri" w:eastAsia="Calibri"/>
                 <w:sz w:val="22"/>
               </w:rPr>
-              <w:t>The probability that no guest receives their own coat differs from 1/e by less than one percentage point.</w:t>
             </w:r>
           </w:p>
         </w:tc>
@@ -2734,7 +2735,7 @@
           <w:b w:val="0"/>
           <w:sz w:val="22"/>
         </w:rPr>
-        <w:t>Total returns: 6! = 720. Number of derangements of 6 items: !6 = 720 · (1 − 1 + 1/2 − 1/6 + 1/24 − 1/120 + 1/720) = 265, so P(none own coat) = 265/720 ≈ 36.81%. Compare to 1/e ≈ 36.7879%: the absolute difference is only about 0.018 percentage points. Exactly 5 fixed points is impossible: if five guests have their own coats, the sixth coat is forced to the remaining guest, so the count is 0 and the probability is 0. Therefore P(at least one own coat) = 1 − 265/720 ≈ 63.19%.</w:t>
+        <w:t>Total returns: 6! = 720. Number of derangements of 6 items: !6 = 265, so P(none own coat) = 265/720 ≈ 36.81%. Exactly two fixed points: C(6,2)·!4 = 15·9 = 135, so P ≈ 18.75%. Exactly 5 fixed points is impossible: if five guests have their own coats, the sixth coat is forced to the remaining guest, so the count is 0. Therefore P(at least one own coat) = 1 − 265/720 ≈ 63.19%.</w:t>
       </w:r>
     </w:p>
     <w:p>
@@ -2838,7 +2839,7 @@
           <w:b w:val="0"/>
           <w:sz w:val="22"/>
         </w:rPr>
-        <w:t>265/720 ≈ 36.806% and 1/e ≈ 36.788% differ by far less than one percentage point (about 0.018 pp).</w:t>
+        <w:t>Exactly two fixed points: C(6,2)·!4 = 15·9 = 135 arrangements, so P = 135/720 = 18.75%, which is greater than 15%.</w:t>
       </w:r>
     </w:p>
     <w:p>
@@ -2851,7 +2852,7 @@
           <w:i/>
           <w:sz w:val="22"/>
         </w:rPr>
-        <w:t>Formula: |265/720 − 1/e| ≈ 0.018 pp &lt; 1 pp</w:t>
+        <w:t>Formula: P(exactly 2 fixed) = C(6,2)·!4 / 6! = 135/720 = 18.75%</w:t>
       </w:r>
     </w:p>
     <w:p>

</xml_diff>